<commit_message>
POO S3 (Encapsulamiento): profundizacion rigurosa (invariantes, accesores, inmutabilidad)
</commit_message>
<xml_diff>
--- a/03-week/optional-activity/pdf/Actividad-Semana03.docx
+++ b/03-week/optional-activity/pdf/Actividad-Semana03.docx
@@ -31,7 +31,7 @@
           <w:sz w:val="22"/>
           <w:szCs w:val="22"/>
         </w:rPr>
-        <w:t xml:space="preserve">Programación y Diseño Orientado a Objetos · Semana 3 · Clase encapsulada con validación</w:t>
+        <w:t xml:space="preserve">Programación y Diseño Orientado a Objetos · Semana 3 · Clase encapsulada que protege su invariante</w:t>
       </w:r>
     </w:p>
     <w:tbl>
@@ -430,7 +430,7 @@
           <w:sz w:val="22"/>
           <w:szCs w:val="22"/>
         </w:rPr>
-        <w:t xml:space="preserve">Declarar atributos privados.</w:t>
+        <w:t xml:space="preserve">Encapsular una clase protegiendo una invariante clara.</w:t>
       </w:r>
     </w:p>
     <w:p>
@@ -454,7 +454,7 @@
           <w:sz w:val="22"/>
           <w:szCs w:val="22"/>
         </w:rPr>
-        <w:t xml:space="preserve">Implementar getters y setters con validación.</w:t>
+        <w:t xml:space="preserve">Validar en las operaciones que modifican el estado.</w:t>
       </w:r>
     </w:p>
     <w:p>
@@ -478,7 +478,7 @@
           <w:sz w:val="22"/>
           <w:szCs w:val="22"/>
         </w:rPr>
-        <w:t xml:space="preserve">Garantizar que el objeto no llegue a estados inválidos.</w:t>
+        <w:t xml:space="preserve">Usar un atributo de solo lectura (final).</w:t>
       </w:r>
     </w:p>
     <w:p>
@@ -539,25 +539,7 @@
           <w:sz w:val="22"/>
           <w:szCs w:val="22"/>
         </w:rPr>
-        <w:t xml:space="preserve"> con atributo privado </w:t>
-      </w:r>
-      <w:r>
-        <w:rPr>
-          <w:rFonts w:ascii="Consolas" w:hAnsi="Consolas" w:cs="Consolas"/>
-          <w:color w:val="000000"/>
-          <w:sz w:val="22"/>
-          <w:szCs w:val="22"/>
-        </w:rPr>
-        <w:t xml:space="preserve">saldo</w:t>
-      </w:r>
-      <w:r>
-        <w:rPr>
-          <w:rFonts w:ascii="Times New Roman" w:hAnsi="Times New Roman" w:cs="Times New Roman"/>
-          <w:color w:val="000000"/>
-          <w:sz w:val="22"/>
-          <w:szCs w:val="22"/>
-        </w:rPr>
-        <w:t xml:space="preserve"> (inicia en 0).</w:t>
+        <w:t xml:space="preserve"> con:</w:t>
       </w:r>
     </w:p>
     <w:p>
@@ -572,16 +554,7 @@
           <w:sz w:val="22"/>
           <w:szCs w:val="22"/>
         </w:rPr>
-        <w:t xml:space="preserve">2.	</w:t>
-      </w:r>
-      <w:r>
-        <w:rPr>
-          <w:rFonts w:ascii="Times New Roman" w:hAnsi="Times New Roman" w:cs="Times New Roman"/>
-          <w:color w:val="000000"/>
-          <w:sz w:val="22"/>
-          <w:szCs w:val="22"/>
-        </w:rPr>
-        <w:t xml:space="preserve">Implementa </w:t>
+        <w:t xml:space="preserve">•	</w:t>
       </w:r>
       <w:r>
         <w:rPr>
@@ -590,16 +563,35 @@
           <w:sz w:val="22"/>
           <w:szCs w:val="22"/>
         </w:rPr>
-        <w:t xml:space="preserve">getSaldo()</w:t>
-      </w:r>
-      <w:r>
-        <w:rPr>
-          <w:rFonts w:ascii="Times New Roman" w:hAnsi="Times New Roman" w:cs="Times New Roman"/>
-          <w:color w:val="000000"/>
-          <w:sz w:val="22"/>
-          <w:szCs w:val="22"/>
-        </w:rPr>
-        <w:t xml:space="preserve">, </w:t>
+        <w:t xml:space="preserve">id</w:t>
+      </w:r>
+      <w:r>
+        <w:rPr>
+          <w:rFonts w:ascii="Times New Roman" w:hAnsi="Times New Roman" w:cs="Times New Roman"/>
+          <w:color w:val="000000"/>
+          <w:sz w:val="22"/>
+          <w:szCs w:val="22"/>
+        </w:rPr>
+        <w:t xml:space="preserve"> de </w:t>
+      </w:r>
+      <w:r>
+        <w:rPr>
+          <w:rFonts w:ascii="Times New Roman" w:hAnsi="Times New Roman" w:cs="Times New Roman"/>
+          <w:b/>
+          <w:color w:val="000000"/>
+          <w:sz w:val="22"/>
+          <w:szCs w:val="22"/>
+        </w:rPr>
+        <w:t xml:space="preserve">solo lectura</w:t>
+      </w:r>
+      <w:r>
+        <w:rPr>
+          <w:rFonts w:ascii="Times New Roman" w:hAnsi="Times New Roman" w:cs="Times New Roman"/>
+          <w:color w:val="000000"/>
+          <w:sz w:val="22"/>
+          <w:szCs w:val="22"/>
+        </w:rPr>
+        <w:t xml:space="preserve"> (</w:t>
       </w:r>
       <w:r>
         <w:rPr>
@@ -608,34 +600,16 @@
           <w:sz w:val="22"/>
           <w:szCs w:val="22"/>
         </w:rPr>
-        <w:t xml:space="preserve">consignar(double)</w:t>
-      </w:r>
-      <w:r>
-        <w:rPr>
-          <w:rFonts w:ascii="Times New Roman" w:hAnsi="Times New Roman" w:cs="Times New Roman"/>
-          <w:color w:val="000000"/>
-          <w:sz w:val="22"/>
-          <w:szCs w:val="22"/>
-        </w:rPr>
-        <w:t xml:space="preserve"> y </w:t>
-      </w:r>
-      <w:r>
-        <w:rPr>
-          <w:rFonts w:ascii="Consolas" w:hAnsi="Consolas" w:cs="Consolas"/>
-          <w:color w:val="000000"/>
-          <w:sz w:val="22"/>
-          <w:szCs w:val="22"/>
-        </w:rPr>
-        <w:t xml:space="preserve">retirar(double)</w:t>
-      </w:r>
-      <w:r>
-        <w:rPr>
-          <w:rFonts w:ascii="Times New Roman" w:hAnsi="Times New Roman" w:cs="Times New Roman"/>
-          <w:color w:val="000000"/>
-          <w:sz w:val="22"/>
-          <w:szCs w:val="22"/>
-        </w:rPr>
-        <w:t xml:space="preserve">.</w:t>
+        <w:t xml:space="preserve">private final</w:t>
+      </w:r>
+      <w:r>
+        <w:rPr>
+          <w:rFonts w:ascii="Times New Roman" w:hAnsi="Times New Roman" w:cs="Times New Roman"/>
+          <w:color w:val="000000"/>
+          <w:sz w:val="22"/>
+          <w:szCs w:val="22"/>
+        </w:rPr>
+        <w:t xml:space="preserve">, asignado al crear; solo getter).</w:t>
       </w:r>
     </w:p>
     <w:p>
@@ -650,7 +624,25 @@
           <w:sz w:val="22"/>
           <w:szCs w:val="22"/>
         </w:rPr>
-        <w:t xml:space="preserve">3.	</w:t>
+        <w:t xml:space="preserve">•	</w:t>
+      </w:r>
+      <w:r>
+        <w:rPr>
+          <w:rFonts w:ascii="Consolas" w:hAnsi="Consolas" w:cs="Consolas"/>
+          <w:color w:val="000000"/>
+          <w:sz w:val="22"/>
+          <w:szCs w:val="22"/>
+        </w:rPr>
+        <w:t xml:space="preserve">saldo</w:t>
+      </w:r>
+      <w:r>
+        <w:rPr>
+          <w:rFonts w:ascii="Times New Roman" w:hAnsi="Times New Roman" w:cs="Times New Roman"/>
+          <w:color w:val="000000"/>
+          <w:sz w:val="22"/>
+          <w:szCs w:val="22"/>
+        </w:rPr>
+        <w:t xml:space="preserve"> </w:t>
       </w:r>
       <w:r>
         <w:rPr>
@@ -660,16 +652,34 @@
           <w:sz w:val="22"/>
           <w:szCs w:val="22"/>
         </w:rPr>
-        <w:t xml:space="preserve">Valida:</w:t>
-      </w:r>
-      <w:r>
-        <w:rPr>
-          <w:rFonts w:ascii="Times New Roman" w:hAnsi="Times New Roman" w:cs="Times New Roman"/>
-          <w:color w:val="000000"/>
-          <w:sz w:val="22"/>
-          <w:szCs w:val="22"/>
-        </w:rPr>
-        <w:t xml:space="preserve"> no consignar montos ≤ 0; no retirar más que el saldo.</w:t>
+        <w:t xml:space="preserve">privado</w:t>
+      </w:r>
+      <w:r>
+        <w:rPr>
+          <w:rFonts w:ascii="Times New Roman" w:hAnsi="Times New Roman" w:cs="Times New Roman"/>
+          <w:color w:val="000000"/>
+          <w:sz w:val="22"/>
+          <w:szCs w:val="22"/>
+        </w:rPr>
+        <w:t xml:space="preserve"> (invariante: </w:t>
+      </w:r>
+      <w:r>
+        <w:rPr>
+          <w:rFonts w:ascii="Consolas" w:hAnsi="Consolas" w:cs="Consolas"/>
+          <w:color w:val="000000"/>
+          <w:sz w:val="22"/>
+          <w:szCs w:val="22"/>
+        </w:rPr>
+        <w:t xml:space="preserve">saldo &gt;= 0</w:t>
+      </w:r>
+      <w:r>
+        <w:rPr>
+          <w:rFonts w:ascii="Times New Roman" w:hAnsi="Times New Roman" w:cs="Times New Roman"/>
+          <w:color w:val="000000"/>
+          <w:sz w:val="22"/>
+          <w:szCs w:val="22"/>
+        </w:rPr>
+        <w:t xml:space="preserve">).</w:t>
       </w:r>
     </w:p>
     <w:p>
@@ -684,7 +694,257 @@
           <w:sz w:val="22"/>
           <w:szCs w:val="22"/>
         </w:rPr>
-        <w:t xml:space="preserve">4.	</w:t>
+        <w:t xml:space="preserve">1.	</w:t>
+      </w:r>
+      <w:r>
+        <w:rPr>
+          <w:rFonts w:ascii="Times New Roman" w:hAnsi="Times New Roman" w:cs="Times New Roman"/>
+          <w:color w:val="000000"/>
+          <w:sz w:val="22"/>
+          <w:szCs w:val="22"/>
+        </w:rPr>
+        <w:t xml:space="preserve">Implementa </w:t>
+      </w:r>
+      <w:r>
+        <w:rPr>
+          <w:rFonts w:ascii="Times New Roman" w:hAnsi="Times New Roman" w:cs="Times New Roman"/>
+          <w:b/>
+          <w:color w:val="000000"/>
+          <w:sz w:val="22"/>
+          <w:szCs w:val="22"/>
+        </w:rPr>
+        <w:t xml:space="preserve">operaciones de dominio</w:t>
+      </w:r>
+      <w:r>
+        <w:rPr>
+          <w:rFonts w:ascii="Times New Roman" w:hAnsi="Times New Roman" w:cs="Times New Roman"/>
+          <w:color w:val="000000"/>
+          <w:sz w:val="22"/>
+          <w:szCs w:val="22"/>
+        </w:rPr>
+        <w:t xml:space="preserve"> (no un </w:t>
+      </w:r>
+      <w:r>
+        <w:rPr>
+          <w:rFonts w:ascii="Consolas" w:hAnsi="Consolas" w:cs="Consolas"/>
+          <w:color w:val="000000"/>
+          <w:sz w:val="22"/>
+          <w:szCs w:val="22"/>
+        </w:rPr>
+        <w:t xml:space="preserve">setSaldo</w:t>
+      </w:r>
+      <w:r>
+        <w:rPr>
+          <w:rFonts w:ascii="Times New Roman" w:hAnsi="Times New Roman" w:cs="Times New Roman"/>
+          <w:color w:val="000000"/>
+          <w:sz w:val="22"/>
+          <w:szCs w:val="22"/>
+        </w:rPr>
+        <w:t xml:space="preserve"> genérico):</w:t>
+      </w:r>
+    </w:p>
+    <w:p>
+      <w:pPr>
+        <w:spacing w:after="120" w:line="276" w:lineRule="auto"/>
+        <w:ind w:left="454" w:hanging="284"/>
+      </w:pPr>
+      <w:r>
+        <w:rPr>
+          <w:rFonts w:ascii="Times New Roman" w:hAnsi="Times New Roman" w:cs="Times New Roman"/>
+          <w:color w:val="000000"/>
+          <w:sz w:val="22"/>
+          <w:szCs w:val="22"/>
+        </w:rPr>
+        <w:t xml:space="preserve">•	</w:t>
+      </w:r>
+      <w:r>
+        <w:rPr>
+          <w:rFonts w:ascii="Consolas" w:hAnsi="Consolas" w:cs="Consolas"/>
+          <w:color w:val="000000"/>
+          <w:sz w:val="22"/>
+          <w:szCs w:val="22"/>
+        </w:rPr>
+        <w:t xml:space="preserve">consignar(double monto)</w:t>
+      </w:r>
+      <w:r>
+        <w:rPr>
+          <w:rFonts w:ascii="Times New Roman" w:hAnsi="Times New Roman" w:cs="Times New Roman"/>
+          <w:color w:val="000000"/>
+          <w:sz w:val="22"/>
+          <w:szCs w:val="22"/>
+        </w:rPr>
+        <w:t xml:space="preserve"> — solo si </w:t>
+      </w:r>
+      <w:r>
+        <w:rPr>
+          <w:rFonts w:ascii="Consolas" w:hAnsi="Consolas" w:cs="Consolas"/>
+          <w:color w:val="000000"/>
+          <w:sz w:val="22"/>
+          <w:szCs w:val="22"/>
+        </w:rPr>
+        <w:t xml:space="preserve">monto &gt; 0</w:t>
+      </w:r>
+      <w:r>
+        <w:rPr>
+          <w:rFonts w:ascii="Times New Roman" w:hAnsi="Times New Roman" w:cs="Times New Roman"/>
+          <w:color w:val="000000"/>
+          <w:sz w:val="22"/>
+          <w:szCs w:val="22"/>
+        </w:rPr>
+        <w:t xml:space="preserve">.</w:t>
+      </w:r>
+    </w:p>
+    <w:p>
+      <w:pPr>
+        <w:spacing w:after="120" w:line="276" w:lineRule="auto"/>
+        <w:ind w:left="454" w:hanging="284"/>
+      </w:pPr>
+      <w:r>
+        <w:rPr>
+          <w:rFonts w:ascii="Times New Roman" w:hAnsi="Times New Roman" w:cs="Times New Roman"/>
+          <w:color w:val="000000"/>
+          <w:sz w:val="22"/>
+          <w:szCs w:val="22"/>
+        </w:rPr>
+        <w:t xml:space="preserve">•	</w:t>
+      </w:r>
+      <w:r>
+        <w:rPr>
+          <w:rFonts w:ascii="Consolas" w:hAnsi="Consolas" w:cs="Consolas"/>
+          <w:color w:val="000000"/>
+          <w:sz w:val="22"/>
+          <w:szCs w:val="22"/>
+        </w:rPr>
+        <w:t xml:space="preserve">retirar(double monto)</w:t>
+      </w:r>
+      <w:r>
+        <w:rPr>
+          <w:rFonts w:ascii="Times New Roman" w:hAnsi="Times New Roman" w:cs="Times New Roman"/>
+          <w:color w:val="000000"/>
+          <w:sz w:val="22"/>
+          <w:szCs w:val="22"/>
+        </w:rPr>
+        <w:t xml:space="preserve"> — solo si </w:t>
+      </w:r>
+      <w:r>
+        <w:rPr>
+          <w:rFonts w:ascii="Consolas" w:hAnsi="Consolas" w:cs="Consolas"/>
+          <w:color w:val="000000"/>
+          <w:sz w:val="22"/>
+          <w:szCs w:val="22"/>
+        </w:rPr>
+        <w:t xml:space="preserve">monto &gt; 0</w:t>
+      </w:r>
+      <w:r>
+        <w:rPr>
+          <w:rFonts w:ascii="Times New Roman" w:hAnsi="Times New Roman" w:cs="Times New Roman"/>
+          <w:color w:val="000000"/>
+          <w:sz w:val="22"/>
+          <w:szCs w:val="22"/>
+        </w:rPr>
+        <w:t xml:space="preserve"> y </w:t>
+      </w:r>
+      <w:r>
+        <w:rPr>
+          <w:rFonts w:ascii="Consolas" w:hAnsi="Consolas" w:cs="Consolas"/>
+          <w:color w:val="000000"/>
+          <w:sz w:val="22"/>
+          <w:szCs w:val="22"/>
+        </w:rPr>
+        <w:t xml:space="preserve">monto &lt;= saldo</w:t>
+      </w:r>
+      <w:r>
+        <w:rPr>
+          <w:rFonts w:ascii="Times New Roman" w:hAnsi="Times New Roman" w:cs="Times New Roman"/>
+          <w:color w:val="000000"/>
+          <w:sz w:val="22"/>
+          <w:szCs w:val="22"/>
+        </w:rPr>
+        <w:t xml:space="preserve"> (devuelve </w:t>
+      </w:r>
+      <w:r>
+        <w:rPr>
+          <w:rFonts w:ascii="Consolas" w:hAnsi="Consolas" w:cs="Consolas"/>
+          <w:color w:val="000000"/>
+          <w:sz w:val="22"/>
+          <w:szCs w:val="22"/>
+        </w:rPr>
+        <w:t xml:space="preserve">boolean</w:t>
+      </w:r>
+      <w:r>
+        <w:rPr>
+          <w:rFonts w:ascii="Times New Roman" w:hAnsi="Times New Roman" w:cs="Times New Roman"/>
+          <w:color w:val="000000"/>
+          <w:sz w:val="22"/>
+          <w:szCs w:val="22"/>
+        </w:rPr>
+        <w:t xml:space="preserve">).</w:t>
+      </w:r>
+    </w:p>
+    <w:p>
+      <w:pPr>
+        <w:spacing w:after="120" w:line="276" w:lineRule="auto"/>
+        <w:ind w:left="454" w:hanging="284"/>
+      </w:pPr>
+      <w:r>
+        <w:rPr>
+          <w:rFonts w:ascii="Times New Roman" w:hAnsi="Times New Roman" w:cs="Times New Roman"/>
+          <w:color w:val="000000"/>
+          <w:sz w:val="22"/>
+          <w:szCs w:val="22"/>
+        </w:rPr>
+        <w:t xml:space="preserve">•	</w:t>
+      </w:r>
+      <w:r>
+        <w:rPr>
+          <w:rFonts w:ascii="Consolas" w:hAnsi="Consolas" w:cs="Consolas"/>
+          <w:color w:val="000000"/>
+          <w:sz w:val="22"/>
+          <w:szCs w:val="22"/>
+        </w:rPr>
+        <w:t xml:space="preserve">getSaldo()</w:t>
+      </w:r>
+      <w:r>
+        <w:rPr>
+          <w:rFonts w:ascii="Times New Roman" w:hAnsi="Times New Roman" w:cs="Times New Roman"/>
+          <w:color w:val="000000"/>
+          <w:sz w:val="22"/>
+          <w:szCs w:val="22"/>
+        </w:rPr>
+        <w:t xml:space="preserve"> y </w:t>
+      </w:r>
+      <w:r>
+        <w:rPr>
+          <w:rFonts w:ascii="Consolas" w:hAnsi="Consolas" w:cs="Consolas"/>
+          <w:color w:val="000000"/>
+          <w:sz w:val="22"/>
+          <w:szCs w:val="22"/>
+        </w:rPr>
+        <w:t xml:space="preserve">getId()</w:t>
+      </w:r>
+      <w:r>
+        <w:rPr>
+          <w:rFonts w:ascii="Times New Roman" w:hAnsi="Times New Roman" w:cs="Times New Roman"/>
+          <w:color w:val="000000"/>
+          <w:sz w:val="22"/>
+          <w:szCs w:val="22"/>
+        </w:rPr>
+        <w:t xml:space="preserve">.</w:t>
+      </w:r>
+    </w:p>
+    <w:p>
+      <w:pPr>
+        <w:spacing w:after="120" w:line="276" w:lineRule="auto"/>
+        <w:ind w:left="454" w:hanging="284"/>
+      </w:pPr>
+      <w:r>
+        <w:rPr>
+          <w:rFonts w:ascii="Times New Roman" w:hAnsi="Times New Roman" w:cs="Times New Roman"/>
+          <w:color w:val="000000"/>
+          <w:sz w:val="22"/>
+          <w:szCs w:val="22"/>
+        </w:rPr>
+        <w:t xml:space="preserve">1.	</w:t>
       </w:r>
       <w:r>
         <w:rPr>
@@ -702,16 +962,77 @@
           <w:sz w:val="22"/>
           <w:szCs w:val="22"/>
         </w:rPr>
-        <w:t xml:space="preserve">main</w:t>
-      </w:r>
-      <w:r>
-        <w:rPr>
-          <w:rFonts w:ascii="Times New Roman" w:hAnsi="Times New Roman" w:cs="Times New Roman"/>
-          <w:color w:val="000000"/>
-          <w:sz w:val="22"/>
-          <w:szCs w:val="22"/>
-        </w:rPr>
-        <w:t xml:space="preserve">, prueba casos válidos e inválidos y muestra el saldo tras cada uno.</w:t>
+        <w:t xml:space="preserve">Main</w:t>
+      </w:r>
+      <w:r>
+        <w:rPr>
+          <w:rFonts w:ascii="Times New Roman" w:hAnsi="Times New Roman" w:cs="Times New Roman"/>
+          <w:color w:val="000000"/>
+          <w:sz w:val="22"/>
+          <w:szCs w:val="22"/>
+        </w:rPr>
+        <w:t xml:space="preserve">, </w:t>
+      </w:r>
+      <w:r>
+        <w:rPr>
+          <w:rFonts w:ascii="Times New Roman" w:hAnsi="Times New Roman" w:cs="Times New Roman"/>
+          <w:b/>
+          <w:color w:val="000000"/>
+          <w:sz w:val="22"/>
+          <w:szCs w:val="22"/>
+        </w:rPr>
+        <w:t xml:space="preserve">demuestra que la invariante no se puede violar</w:t>
+      </w:r>
+      <w:r>
+        <w:rPr>
+          <w:rFonts w:ascii="Times New Roman" w:hAnsi="Times New Roman" w:cs="Times New Roman"/>
+          <w:color w:val="000000"/>
+          <w:sz w:val="22"/>
+          <w:szCs w:val="22"/>
+        </w:rPr>
+        <w:t xml:space="preserve">: intenta consignar/retirar montos inválidos y muestra que el saldo nunca queda negativo.</w:t>
+      </w:r>
+    </w:p>
+    <w:p>
+      <w:pPr>
+        <w:spacing w:after="120" w:line="276" w:lineRule="auto"/>
+        <w:ind w:left="454" w:hanging="284"/>
+      </w:pPr>
+      <w:r>
+        <w:rPr>
+          <w:rFonts w:ascii="Times New Roman" w:hAnsi="Times New Roman" w:cs="Times New Roman"/>
+          <w:color w:val="000000"/>
+          <w:sz w:val="22"/>
+          <w:szCs w:val="22"/>
+        </w:rPr>
+        <w:t xml:space="preserve">2.	</w:t>
+      </w:r>
+      <w:r>
+        <w:rPr>
+          <w:rFonts w:ascii="Times New Roman" w:hAnsi="Times New Roman" w:cs="Times New Roman"/>
+          <w:color w:val="000000"/>
+          <w:sz w:val="22"/>
+          <w:szCs w:val="22"/>
+        </w:rPr>
+        <w:t xml:space="preserve">Explica en el README por qué NO expusiste </w:t>
+      </w:r>
+      <w:r>
+        <w:rPr>
+          <w:rFonts w:ascii="Consolas" w:hAnsi="Consolas" w:cs="Consolas"/>
+          <w:color w:val="000000"/>
+          <w:sz w:val="22"/>
+          <w:szCs w:val="22"/>
+        </w:rPr>
+        <w:t xml:space="preserve">setSaldo</w:t>
+      </w:r>
+      <w:r>
+        <w:rPr>
+          <w:rFonts w:ascii="Times New Roman" w:hAnsi="Times New Roman" w:cs="Times New Roman"/>
+          <w:color w:val="000000"/>
+          <w:sz w:val="22"/>
+          <w:szCs w:val="22"/>
+        </w:rPr>
+        <w:t xml:space="preserve">.</w:t>
       </w:r>
     </w:p>
     <w:p>
@@ -772,7 +1093,43 @@
           <w:sz w:val="22"/>
           <w:szCs w:val="22"/>
         </w:rPr>
-        <w:t xml:space="preserve">.</w:t>
+        <w:t xml:space="preserve">; </w:t>
+      </w:r>
+      <w:r>
+        <w:rPr>
+          <w:rFonts w:ascii="Consolas" w:hAnsi="Consolas" w:cs="Consolas"/>
+          <w:color w:val="000000"/>
+          <w:sz w:val="22"/>
+          <w:szCs w:val="22"/>
+        </w:rPr>
+        <w:t xml:space="preserve">id</w:t>
+      </w:r>
+      <w:r>
+        <w:rPr>
+          <w:rFonts w:ascii="Times New Roman" w:hAnsi="Times New Roman" w:cs="Times New Roman"/>
+          <w:color w:val="000000"/>
+          <w:sz w:val="22"/>
+          <w:szCs w:val="22"/>
+        </w:rPr>
+        <w:t xml:space="preserve"> con </w:t>
+      </w:r>
+      <w:r>
+        <w:rPr>
+          <w:rFonts w:ascii="Consolas" w:hAnsi="Consolas" w:cs="Consolas"/>
+          <w:color w:val="000000"/>
+          <w:sz w:val="22"/>
+          <w:szCs w:val="22"/>
+        </w:rPr>
+        <w:t xml:space="preserve">final</w:t>
+      </w:r>
+      <w:r>
+        <w:rPr>
+          <w:rFonts w:ascii="Times New Roman" w:hAnsi="Times New Roman" w:cs="Times New Roman"/>
+          <w:color w:val="000000"/>
+          <w:sz w:val="22"/>
+          <w:szCs w:val="22"/>
+        </w:rPr>
+        <w:t xml:space="preserve"> y sin setter.</w:t>
       </w:r>
     </w:p>
     <w:p>
@@ -796,7 +1153,43 @@
           <w:sz w:val="22"/>
           <w:szCs w:val="22"/>
         </w:rPr>
-        <w:t xml:space="preserve">Validación en consignar y retirar.</w:t>
+        <w:t xml:space="preserve">Validación en </w:t>
+      </w:r>
+      <w:r>
+        <w:rPr>
+          <w:rFonts w:ascii="Consolas" w:hAnsi="Consolas" w:cs="Consolas"/>
+          <w:color w:val="000000"/>
+          <w:sz w:val="22"/>
+          <w:szCs w:val="22"/>
+        </w:rPr>
+        <w:t xml:space="preserve">consignar</w:t>
+      </w:r>
+      <w:r>
+        <w:rPr>
+          <w:rFonts w:ascii="Times New Roman" w:hAnsi="Times New Roman" w:cs="Times New Roman"/>
+          <w:color w:val="000000"/>
+          <w:sz w:val="22"/>
+          <w:szCs w:val="22"/>
+        </w:rPr>
+        <w:t xml:space="preserve"> y </w:t>
+      </w:r>
+      <w:r>
+        <w:rPr>
+          <w:rFonts w:ascii="Consolas" w:hAnsi="Consolas" w:cs="Consolas"/>
+          <w:color w:val="000000"/>
+          <w:sz w:val="22"/>
+          <w:szCs w:val="22"/>
+        </w:rPr>
+        <w:t xml:space="preserve">retirar</w:t>
+      </w:r>
+      <w:r>
+        <w:rPr>
+          <w:rFonts w:ascii="Times New Roman" w:hAnsi="Times New Roman" w:cs="Times New Roman"/>
+          <w:color w:val="000000"/>
+          <w:sz w:val="22"/>
+          <w:szCs w:val="22"/>
+        </w:rPr>
+        <w:t xml:space="preserve">.</w:t>
       </w:r>
     </w:p>
     <w:p>
@@ -820,7 +1213,7 @@
           <w:sz w:val="22"/>
           <w:szCs w:val="22"/>
         </w:rPr>
-        <w:t xml:space="preserve">Casos de prueba válidos e inválidos.</w:t>
+        <w:t xml:space="preserve">Casos de prueba válidos e inválidos que evidencien la protección de la invariante.</w:t>
       </w:r>
     </w:p>
     <w:p>
@@ -923,7 +1316,7 @@
           <w:sz w:val="18"/>
           <w:szCs w:val="18"/>
         </w:rPr>
-        <w:t xml:space="preserve">  README.md   -&gt; casos de prueba + resultados</w:t>
+        <w:t xml:space="preserve">  README.md   -&gt; casos de prueba + por que no hay setSaldo</w:t>
       </w:r>
     </w:p>
     <w:p>
@@ -963,7 +1356,7 @@
           <w:sz w:val="22"/>
           <w:szCs w:val="22"/>
         </w:rPr>
-        <w:t xml:space="preserve">Crea el repo público con ese nombre.</w:t>
+        <w:t xml:space="preserve">Crea el repositorio público con ese nombre.</w:t>
       </w:r>
     </w:p>
     <w:p>
@@ -1011,7 +1404,7 @@
           <w:sz w:val="22"/>
           <w:szCs w:val="22"/>
         </w:rPr>
-        <w:t xml:space="preserve">Comparte el enlace por el canal indicado.</w:t>
+        <w:t xml:space="preserve">Comparte el enlace por el canal indicado por el docente.</w:t>
       </w:r>
     </w:p>
     <w:p>
@@ -1094,7 +1487,7 @@
                 <w:sz w:val="20"/>
                 <w:szCs w:val="20"/>
               </w:rPr>
-              <w:t xml:space="preserve">Excelente</w:t>
+              <w:t xml:space="preserve">Excelente (100%)</w:t>
             </w:r>
           </w:p>
         </w:tc>
@@ -1116,7 +1509,7 @@
                 <w:sz w:val="20"/>
                 <w:szCs w:val="20"/>
               </w:rPr>
-              <w:t xml:space="preserve">Aceptable</w:t>
+              <w:t xml:space="preserve">Aceptable (60%)</w:t>
             </w:r>
           </w:p>
         </w:tc>
@@ -1138,7 +1531,7 @@
                 <w:sz w:val="20"/>
                 <w:szCs w:val="20"/>
               </w:rPr>
-              <w:t xml:space="preserve">Por mejorar</w:t>
+              <w:t xml:space="preserve">Por mejorar (0%)</w:t>
             </w:r>
           </w:p>
         </w:tc>
@@ -1182,7 +1575,7 @@
                 <w:sz w:val="20"/>
                 <w:szCs w:val="20"/>
               </w:rPr>
-              <w:t xml:space="preserve">Atributos privados</w:t>
+              <w:t xml:space="preserve">Atributos privados + id final (solo lectura)</w:t>
             </w:r>
           </w:p>
         </w:tc>
@@ -1222,7 +1615,7 @@
                 <w:sz w:val="20"/>
                 <w:szCs w:val="20"/>
               </w:rPr>
-              <w:t xml:space="preserve">—</w:t>
+              <w:t xml:space="preserve">Con detalles</w:t>
             </w:r>
           </w:p>
         </w:tc>
@@ -1242,7 +1635,7 @@
                 <w:sz w:val="20"/>
                 <w:szCs w:val="20"/>
               </w:rPr>
-              <w:t xml:space="preserve">Públicos</w:t>
+              <w:t xml:space="preserve">Falla</w:t>
             </w:r>
           </w:p>
         </w:tc>
@@ -1262,7 +1655,7 @@
                 <w:sz w:val="20"/>
                 <w:szCs w:val="20"/>
               </w:rPr>
-              <w:t xml:space="preserve">20</w:t>
+              <w:t xml:space="preserve">25</w:t>
             </w:r>
           </w:p>
         </w:tc>
@@ -1284,7 +1677,7 @@
                 <w:sz w:val="20"/>
                 <w:szCs w:val="20"/>
               </w:rPr>
-              <w:t xml:space="preserve">Getters/métodos</w:t>
+              <w:t xml:space="preserve">Operaciones de dominio validadas</w:t>
             </w:r>
           </w:p>
         </w:tc>
@@ -1304,7 +1697,7 @@
                 <w:sz w:val="20"/>
                 <w:szCs w:val="20"/>
               </w:rPr>
-              <w:t xml:space="preserve">Correctos</w:t>
+              <w:t xml:space="preserve">consignar y retirar robustos</w:t>
             </w:r>
           </w:p>
         </w:tc>
@@ -1324,7 +1717,7 @@
                 <w:sz w:val="20"/>
                 <w:szCs w:val="20"/>
               </w:rPr>
-              <w:t xml:space="preserve">Con detalles</w:t>
+              <w:t xml:space="preserve">Uno validado</w:t>
             </w:r>
           </w:p>
         </w:tc>
@@ -1344,7 +1737,7 @@
                 <w:sz w:val="20"/>
                 <w:szCs w:val="20"/>
               </w:rPr>
-              <w:t xml:space="preserve">Fallan</w:t>
+              <w:t xml:space="preserve">Sin validar</w:t>
             </w:r>
           </w:p>
         </w:tc>
@@ -1364,7 +1757,7 @@
                 <w:sz w:val="20"/>
                 <w:szCs w:val="20"/>
               </w:rPr>
-              <w:t xml:space="preserve">25</w:t>
+              <w:t xml:space="preserve">35</w:t>
             </w:r>
           </w:p>
         </w:tc>
@@ -1386,7 +1779,7 @@
                 <w:sz w:val="20"/>
                 <w:szCs w:val="20"/>
               </w:rPr>
-              <w:t xml:space="preserve">Validación (consignar/retirar)</w:t>
+              <w:t xml:space="preserve">Invariante protegida (demostrada)</w:t>
             </w:r>
           </w:p>
         </w:tc>
@@ -1406,7 +1799,7 @@
                 <w:sz w:val="20"/>
                 <w:szCs w:val="20"/>
               </w:rPr>
-              <w:t xml:space="preserve">Robusta</w:t>
+              <w:t xml:space="preserve">Casos válidos e inválidos claros</w:t>
             </w:r>
           </w:p>
         </w:tc>
@@ -1466,7 +1859,7 @@
                 <w:sz w:val="20"/>
                 <w:szCs w:val="20"/>
               </w:rPr>
-              <w:t xml:space="preserve">35</w:t>
+              <w:t xml:space="preserve">25</w:t>
             </w:r>
           </w:p>
         </w:tc>
@@ -1488,7 +1881,7 @@
                 <w:sz w:val="20"/>
                 <w:szCs w:val="20"/>
               </w:rPr>
-              <w:t xml:space="preserve">Casos de prueba y README</w:t>
+              <w:t xml:space="preserve">README (justifica ausencia de setSaldo)</w:t>
             </w:r>
           </w:p>
         </w:tc>
@@ -1508,7 +1901,7 @@
                 <w:sz w:val="20"/>
                 <w:szCs w:val="20"/>
               </w:rPr>
-              <w:t xml:space="preserve">Claros</w:t>
+              <w:t xml:space="preserve">Claro</w:t>
             </w:r>
           </w:p>
         </w:tc>
@@ -1528,7 +1921,7 @@
                 <w:sz w:val="20"/>
                 <w:szCs w:val="20"/>
               </w:rPr>
-              <w:t xml:space="preserve">Aceptables</w:t>
+              <w:t xml:space="preserve">Básico</w:t>
             </w:r>
           </w:p>
         </w:tc>
@@ -1548,7 +1941,7 @@
                 <w:sz w:val="20"/>
                 <w:szCs w:val="20"/>
               </w:rPr>
-              <w:t xml:space="preserve">Deficientes</w:t>
+              <w:t xml:space="preserve">Ausente</w:t>
             </w:r>
           </w:p>
         </w:tc>
@@ -1568,7 +1961,7 @@
                 <w:sz w:val="20"/>
                 <w:szCs w:val="20"/>
               </w:rPr>
-              <w:t xml:space="preserve">20</w:t>
+              <w:t xml:space="preserve">15</w:t>
             </w:r>
           </w:p>
         </w:tc>
@@ -1587,7 +1980,7 @@
           <w:sz w:val="21"/>
           <w:szCs w:val="21"/>
         </w:rPr>
-        <w:t xml:space="preserve">Nota: actividad formativa y opcional (sin nota en Moodle). La guía unificada de entrega estará en el Manual de Entrega de Actividades Opcionales (próximamente).</w:t>
+        <w:t xml:space="preserve">Nota: actividad formativa y opcional (sin nota en Moodle). La guía unificada para entregar todas las actividades opcionales, válida para todas las materias, estará en el Manual de Entrega de Actividades Opcionales (próximamente).</w:t>
       </w:r>
     </w:p>
     <w:sectPr>

</xml_diff>